<commit_message>
Correct the leakage comparison and stale figures; add a project context document
The random-split vs session-disjoint comparison paired two different models.
It now uses one recipe: 98.5 % against 70.1 % (mean of two seeds), about 28
points. Updated the figure, diagram, case study, older review deliverables,
and the Review 3 report and slides.

Also: three-seed results in the Review 2 case study, a corrected McNemar
claim, the honest-number trajectory, iSign clip and source-video counts, README
counts and layout, and a local-path fix in a diagnostic script.

Adds docs/PROJECT_CONTEXT.md, a structured account of the whole project with
the algorithm, rationale and evidence location for every result.
</commit_message>
<xml_diff>
--- a/ISL_ViT_Tiny_Review_Pack.docx
+++ b/ISL_ViT_Tiny_Review_Pack.docx
@@ -4057,7 +4057,7 @@
           <w:sz w:val="20"/>
           <w:szCs w:val="20"/>
         </w:rPr>
-        <w:t xml:space="preserve">The same model on a random split reaches </w:t>
+        <w:t xml:space="preserve">A 50-word model of the same recipe reaches </w:t>
       </w:r>
       <w:r>
         <w:rPr>
@@ -4069,7 +4069,7 @@
           <w:sz w:val="20"/>
           <w:szCs w:val="20"/>
         </w:rPr>
-        <w:t xml:space="preserve">97.9 %</w:t>
+        <w:t xml:space="preserve">98.5 %</w:t>
       </w:r>
       <w:r>
         <w:rPr>
@@ -4081,7 +4081,7 @@
           <w:sz w:val="20"/>
           <w:szCs w:val="20"/>
         </w:rPr>
-        <w:t xml:space="preserve">, so 22.1 points of leakage remain visible between the two protocols even after the honest number has been raised (Figure 9.2). The project’s value is that both numbers are measured with the same code.</w:t>
+        <w:t xml:space="preserve">, against about 70 % on unseen sessions, so about 28 points of leakage remain visible between the two protocols even after the honest number has been raised (Figure 9.2). The project’s value is that both numbers are measured with the same code.</w:t>
       </w:r>
     </w:p>
     <w:p>

</xml_diff>